<commit_message>
fix: corregir validaciones de tickets y estabilizar pruebas
- Validar identificadores de tickets para evitar errores internos.
- Permitir bases de pruebas con nombres configurables.
- Corregir errores de tipado en formularios, modelos y pruebas.
- Actualizar guías 2.4 y 2.6 con una descripción general del proyecto.

Verificado: 376 pruebas aprobadas y Pyright sin errores.
</commit_message>
<xml_diff>
--- a/Fase 2/Evidencias Grupales/2.4_Guía Estudiante_Fase 2_Desarrollo Proyecto APT.docx.docx
+++ b/Fase 2/Evidencias Grupales/2.4_Guía Estudiante_Fase 2_Desarrollo Proyecto APT.docx.docx
@@ -1078,55 +1078,6 @@
               <w:spacing w:after="100" w:before="90" w:line="259" w:lineRule="auto"/>
               <w:ind w:right="0" w:firstLine="0" w:left="0"/>
               <w:jc w:val="left"/>
-              <w:rPr>
-                <w:rFonts w:ascii="Calibri" w:hAnsi="Calibri" w:cs="Calibri"/>
-                <w:color w:val="000000"/>
-                <w:sz w:val="20"/>
-                <w:szCs w:val="20"/>
-              </w:rPr>
-            </w:pPr>
-            <w:r>
-              <w:rPr>
-                <w:rFonts w:ascii="Calibri" w:hAnsi="Calibri" w:cs="Calibri"/>
-                <w:color w:val="000000"/>
-                <w:sz w:val="20"/>
-                <w:szCs w:val="20"/>
-              </w:rPr>
-            </w:r>
-            <w:r>
-              <w:rPr>
-                <w:rFonts w:ascii="Calibri" w:hAnsi="Calibri" w:cs="Calibri"/>
-                <w:color w:val="000000"/>
-                <w:sz w:val="20"/>
-                <w:szCs w:val="20"/>
-              </w:rPr>
-              <w:t xml:space="preserve">Corte de información: 16 de octubre de 2026. </w:t>
-            </w:r>
-            <w:r>
-              <w:rPr>
-                <w:rFonts w:ascii="Calibri" w:hAnsi="Calibri" w:cs="Calibri"/>
-                <w:color w:val="000000"/>
-                <w:sz w:val="20"/>
-                <w:szCs w:val="20"/>
-              </w:rPr>
-            </w:r>
-            <w:r>
-              <w:rPr>
-                <w:rFonts w:ascii="Calibri" w:hAnsi="Calibri" w:cs="Calibri"/>
-                <w:color w:val="000000"/>
-                <w:sz w:val="20"/>
-                <w:szCs w:val="20"/>
-              </w:rPr>
-            </w:r>
-          </w:p>
-          <w:p>
-            <w:pPr>
-              <w:keepNext w:val="false"/>
-              <w:keepLines w:val="true"/>
-              <w:widowControl w:val="true"/>
-              <w:spacing w:after="100" w:before="90" w:line="259" w:lineRule="auto"/>
-              <w:ind w:right="0" w:firstLine="0" w:left="0"/>
-              <w:jc w:val="left"/>
               <w:rPr/>
             </w:pPr>
             <w:r>
@@ -1158,7 +1109,7 @@
                 <w:sz w:val="20"/>
                 <w:szCs w:val="20"/>
               </w:rPr>
-              <w:t xml:space="preserve">Hasta el corte de este informe, SIGET cuenta con la definición del proyecto, requerimientos, arquitectura preliminar, mode</w:t>
+              <w:t xml:space="preserve">SIGET cuenta con la definición del proyecto, los requerimientos, la arquitectura preliminar, el modelo PostgreSQL de 34 tablas y un entorno Docker. Se desarrollaron la integración de acceso con Auth0, la recuperación de acceso, la administración de usuarios y los permisos por rol, junto con las operaciones de activos, asignaciones y registro inicial de tickets.</w:t>
             </w:r>
             <w:r>
               <w:rPr>
@@ -1167,7 +1118,7 @@
                 <w:sz w:val="20"/>
                 <w:szCs w:val="20"/>
               </w:rPr>
-              <w:t xml:space="preserve">lo PostgreSQL de 34 tablas y entorno Docker. Se implementaron autenticación federada con Auth0, recuperación de acceso, administración de usuarios y RBAC, registro, modificación y consulta de activos, y las APIs del ciclo inicial de asignaciones y tickets.</w:t>
+              <w:t xml:space="preserve"/>
             </w:r>
             <w:r/>
           </w:p>
@@ -1220,7 +1171,7 @@
                 <w:sz w:val="20"/>
                 <w:szCs w:val="20"/>
               </w:rPr>
-              <w:t xml:space="preserve">Los objetivos de análisis y modelamiento tienen sus artefactos base disponibles; despliegue, desarrollo e integración presentan un incremento funcional verificado. La última ejecución local a</w:t>
+              <w:t xml:space="preserve">El portal Web permite solicitar equipos por categoría y registrar tickets mediante formularios con validaciones y confirmación. Las pruebas automatizadas comprueban reglas de negocio, permisos y persistencia en PostgreSQL. El desarrollo continúa con el cliente de Escritorio, las consultas y el seguimiento del portal, la gestión de taller y las validaciones integrales de calidad.</w:t>
             </w:r>
             <w:r>
               <w:rPr>
@@ -1229,7 +1180,7 @@
                 <w:sz w:val="20"/>
                 <w:szCs w:val="20"/>
               </w:rPr>
-              <w:t xml:space="preserve">probó 266 pruebas, 68 con PostgreSQL real. El portal conserva el acceso y la estructura visual, pero aún falta conectar catálogo, solicitudes y tickets. También siguen pendientes PySide6, la operación posterior de taller y la validación integral de cierre.</w:t>
+              <w:t xml:space="preserve"/>
             </w:r>
             <w:r/>
           </w:p>
@@ -1332,7 +1283,7 @@
                 <w:sz w:val="20"/>
                 <w:szCs w:val="20"/>
               </w:rPr>
-              <w:t xml:space="preserve">Análisis y datos: documentación base y modelo disponibles. API</w:t>
+              <w:t xml:space="preserve">Se dispone de análisis, modelo de datos, servicios REST y formularios Web de autoservicio. El entorno local funciona en Docker. Continúan pendientes Escritorio, integraciones complementarias y la validación integral de rendimiento, seguridad y aceptación.</w:t>
             </w:r>
             <w:r>
               <w:rPr>
@@ -1341,7 +1292,7 @@
                 <w:sz w:val="20"/>
                 <w:szCs w:val="20"/>
               </w:rPr>
-              <w:t xml:space="preserve">s y módulos: avance en activos, asignaciones y tickets iniciales; Web y Escritorio incompletos. Despliegue: entorno local verificado. QA y seguridad: pruebas y controles de acceso disponibles; rendimiento, seguridad integral e integración final pendientes.</w:t>
+              <w:t xml:space="preserve"/>
             </w:r>
             <w:r/>
           </w:p>
@@ -1413,7 +1364,7 @@
                 <w:sz w:val="20"/>
                 <w:szCs w:val="20"/>
               </w:rPr>
-              <w:t xml:space="preserve">Se mantiene Scrum, con Joaquín R</w:t>
+              <w:t xml:space="preserve">Se utiliza Scrum para organizar el trabajo por incrementos, con Joaquín Riquelme como Product Owner, Diego Alcaino como Scrum Master y los tres integrantes en desarrollo. Las reuniones y retrospectivas permiten revisar dificultades y ajustar la distribución de tareas.</w:t>
             </w:r>
             <w:r>
               <w:rPr>
@@ -1422,7 +1373,7 @@
                 <w:sz w:val="20"/>
                 <w:szCs w:val="20"/>
               </w:rPr>
-              <w:t xml:space="preserve">iquelme como Product Owner, Diego Alcaino como Scrum Master y los tres integrantes en desarrollo. Los registros de seguimiento y retrospectiva de los Sprints 1 a 4 documentan la evolución inicial y el traslado de parte del alcance del Sprint 4 al Sprint 5.</w:t>
+              <w:t xml:space="preserve"/>
             </w:r>
             <w:r/>
           </w:p>
@@ -1444,7 +1395,7 @@
                 <w:sz w:val="20"/>
                 <w:szCs w:val="20"/>
               </w:rPr>
-              <w:t xml:space="preserve">Trello se utiliza </w:t>
+              <w:t xml:space="preserve">Trello apoya el seguimiento de las tareas y el Product Backlog organiza los requisitos y sus prioridades. Los criterios de aceptación orientan la revisión funcional; el código, las pruebas y las evidencias permiten comprobar el avance de cada incremento.</w:t>
             </w:r>
             <w:r>
               <w:rPr>
@@ -1453,7 +1404,7 @@
                 <w:sz w:val="20"/>
                 <w:szCs w:val="20"/>
               </w:rPr>
-              <w:t xml:space="preserve">para el seguimiento de las tareas. El Product Backlog conserva la planificación y sus estados se actualizarán al cierre del Sprint 5. El avance técnico de este informe se determina con el código y las pruebas; no equivale a declarar cerrado todo el Sprint.</w:t>
+              <w:t xml:space="preserve"/>
             </w:r>
             <w:r/>
           </w:p>
@@ -1475,7 +1426,7 @@
                 <w:sz w:val="20"/>
                 <w:szCs w:val="20"/>
               </w:rPr>
-              <w:t xml:space="preserve">La definic</w:t>
+              <w:t xml:space="preserve">La definición de terminado de la Guía 1.5 contempla pruebas unitarias y de integración, controles básicos de seguridad, funcionamiento en Docker y documentación versionada. La disponibilidad de servicios para el cliente de Escritorio se evalúa por separado de la construcción de su interfaz.</w:t>
             </w:r>
             <w:r>
               <w:rPr>
@@ -1484,7 +1435,7 @@
                 <w:sz w:val="20"/>
                 <w:szCs w:val="20"/>
               </w:rPr>
-              <w:t xml:space="preserve">ión de terminado de la Guía 1.5 exige pruebas unitarias e integración, controles básicos de seguridad, funcionamiento en Docker y documentación versionada. La revisión distingue el backend preparado para PySide6 de una interfaz de Escritorio ya construida.</w:t>
+              <w:t xml:space="preserve"/>
             </w:r>
             <w:r/>
           </w:p>
@@ -1634,7 +1585,7 @@
                 <w:sz w:val="20"/>
                 <w:szCs w:val="20"/>
               </w:rPr>
-              <w:t xml:space="preserve">[E2] Product Backlog e Historias de Usuario: relacionan los flujos con sus criterios de aceptación. E3-H7 pide una categoría; E3-H20 identifica el activo físico al entregar.</w:t>
+              <w:t xml:space="preserve">[E2] Product Backlog e Historias de Usuario: relacionan los procesos y sus criterios de aceptación. La solicitud se realiza por categoría y la selección del equipo físico corresponde a la entrega.</w:t>
             </w:r>
             <w:r/>
           </w:p>
@@ -1811,7 +1762,7 @@
                 <w:sz w:val="20"/>
                 <w:szCs w:val="20"/>
               </w:rPr>
-              <w:t xml:space="preserve">[E4] Código Django/DRF y API_DOCS.md: operaciones, permisos y contratos actuales; permiten reproducir consultas y registros sin presentar las interfaces pendientes como terminadas.</w:t>
+              <w:t xml:space="preserve">[E4] Código Django/DRF y API_DOCS.md: operaciones de activos, asignaciones y tickets, permisos, validaciones y contratos de los servicios. El portal incorpora los formularios de solicitud y reporte de soporte.</w:t>
             </w:r>
             <w:r/>
           </w:p>
@@ -1925,7 +1876,7 @@
                 <w:sz w:val="20"/>
                 <w:szCs w:val="20"/>
               </w:rPr>
-              <w:t xml:space="preserve">[E6] Prueb</w:t>
+              <w:t xml:space="preserve">[E6] Pruebas versionadas de usuarios, activos, asignaciones y tickets. Incluyen casos unitarios con simulaciones y pruebas de integración con PostgreSQL para comprobar persistencia, permisos, estados y operaciones transaccionales.</w:t>
             </w:r>
             <w:r>
               <w:rPr>
@@ -1934,7 +1885,7 @@
                 <w:sz w:val="20"/>
                 <w:szCs w:val="20"/>
               </w:rPr>
-              <w:t xml:space="preserve">as versionadas: usuarios/tests, activos/tests, asignaciones/tests y tickets/tests. La última ejecución local disponible registró «Ran 266 tests in 15.224s — OK», con 68 pruebas sobre PostgreSQL real y 198 con dobles de prueba. Pyright finalizó sin errores.</w:t>
+              <w:t xml:space="preserve"/>
             </w:r>
             <w:r/>
           </w:p>
@@ -2033,7 +1984,7 @@
                 <w:sz w:val="20"/>
                 <w:szCs w:val="20"/>
               </w:rPr>
-              <w:t xml:space="preserve">La suite </w:t>
+              <w:t xml:space="preserve">La suite de integración utiliza una base separada de los datos de trabajo. Los resultados de cada ejecución se registran en sus evidencias de QA. La validación integral considera además rendimiento, seguridad, el proveedor real de autenticación y la aceptación de los flujos completos.</w:t>
             </w:r>
             <w:r>
               <w:rPr>
@@ -2042,7 +1993,7 @@
                 <w:sz w:val="20"/>
                 <w:szCs w:val="20"/>
               </w:rPr>
-              <w:t xml:space="preserve">se ejecuta en una base PostgreSQL de pruebas separada. Los casos comprueban reglas, permisos, persistencia y reversión de operaciones ante fallas. El cierre de QA aún requiere pruebas de rendimiento, seguridad integral y el flujo externo completo de Auth0.</w:t>
+              <w:t xml:space="preserve"/>
             </w:r>
             <w:r/>
           </w:p>
@@ -2064,7 +2015,7 @@
                 <w:sz w:val="20"/>
                 <w:szCs w:val="20"/>
               </w:rPr>
-              <w:t xml:space="preserve">[E7] Seguimiento Scrum: Sprint Backlogs, registros de reuniones y retrospectivas de</w:t>
+              <w:t xml:space="preserve">[E7] Seguimiento Scrum: registros disponibles de planificación, reuniones y retrospectivas que documentan la evolución del trabajo.</w:t>
             </w:r>
             <w:r>
               <w:rPr>
@@ -2074,7 +2025,7 @@
                 <w:szCs w:val="20"/>
                 <w:lang w:val="es-ES"/>
               </w:rPr>
-              <w:t xml:space="preserve"> cada</w:t>
+              <w:t xml:space="preserve"/>
             </w:r>
             <w:r>
               <w:rPr>
@@ -2083,7 +2034,7 @@
                 <w:sz w:val="20"/>
                 <w:szCs w:val="20"/>
               </w:rPr>
-              <w:t xml:space="preserve"> Sprint</w:t>
+              <w:t xml:space="preserve"/>
             </w:r>
             <w:r>
               <w:rPr>
@@ -2093,7 +2044,7 @@
                 <w:szCs w:val="20"/>
                 <w:lang w:val="es-ES"/>
               </w:rPr>
-              <w:t xml:space="preserve">.</w:t>
+              <w:t xml:space="preserve"/>
             </w:r>
             <w:r/>
           </w:p>
@@ -2380,7 +2331,7 @@
                 <w:sz w:val="19"/>
                 <w:szCs w:val="19"/>
               </w:rPr>
-              <w:t xml:space="preserve">Se conservan las diez actividades, duraciones y responsables del plan base de la Guía 1.5. S indica semana académica; son plazos planificados, no horas ni fechas de ejecución comprobadas. El estado corresponde al corte del informe.</w:t>
+              <w:t xml:space="preserve">Se mantienen las diez actividades, duraciones y responsables del plan base de la Guía 1.5. S indica semana académica. El monitoreo describe el avance general y los ajustes de cada actividad.</w:t>
             </w:r>
             <w:r/>
           </w:p>
@@ -3776,9 +3727,9 @@
                 <w:sz w:val="19"/>
                 <w:szCs w:val="19"/>
               </w:rPr>
-              <w:t xml:space="preserve">Acceso</w:t>
+              <w:t xml:space="preserve">Solicitudes</w:t>
               <w:br/>
-              <w:t xml:space="preserve">faltan pantallas</w:t>
+              <w:t xml:space="preserve">y tickets</w:t>
             </w:r>
             <w:r/>
           </w:p>
@@ -3844,7 +3795,7 @@
                 <w:sz w:val="19"/>
                 <w:szCs w:val="19"/>
               </w:rPr>
-              <w:t xml:space="preserve">Conectar portal Web</w:t>
+              <w:t xml:space="preserve">Ampliar portal Web</w:t>
             </w:r>
             <w:r/>
           </w:p>
@@ -4874,7 +4825,7 @@
                 <w:sz w:val="19"/>
                 <w:szCs w:val="19"/>
               </w:rPr>
-              <w:t xml:space="preserve">266 pruebas aprobadas</w:t>
+              <w:t xml:space="preserve">Suite de pruebas</w:t>
             </w:r>
             <w:r/>
           </w:p>
@@ -5786,7 +5737,7 @@
                 <w:sz w:val="20"/>
                 <w:szCs w:val="20"/>
               </w:rPr>
-              <w:t xml:space="preserve">La retrospectiva del Sprint 4 registra postergaciones por planificación académica, trasladadas al Sprint 5. Los conflictos recientes de Git se resolvieron conser</w:t>
+              <w:t xml:space="preserve">La planificación académica y la disponibilidad de tiempo del equipo han requerido reprogramar actividades. Los conflictos al integrar cambios de Git se abordaron conservando las contribuciones y verificando su funcionamiento con pruebas. El seguimiento prioriza las dependencias funcionales y los criterios de aceptación. La práctica profesional paralela se mantiene como un riesgo de disponibilidad identificado en la Guía 1.5.</w:t>
             </w:r>
             <w:r>
               <w:rPr>
@@ -5795,7 +5746,7 @@
                 <w:sz w:val="20"/>
                 <w:szCs w:val="20"/>
               </w:rPr>
-              <w:t xml:space="preserve">vando las contribuciones y comprobando la integración con pruebas. Para continuar se priorizan las pantallas Web y los criterios de aceptación. La práctica profesional paralela sigue siendo un riesgo de disponibilidad de tiempo identificado en la Guía 1.5.</w:t>
+              <w:t xml:space="preserve"/>
             </w:r>
             <w:r/>
           </w:p>
@@ -5883,7 +5834,7 @@
                 <w:szCs w:val="20"/>
               </w:rPr>
               <w:br/>
-              <w:t xml:space="preserve">El alcance funcional pendiente del Sprint 4 se trasladó al Sprint 5, manteniendo los objetivos.</w:t>
+              <w:t xml:space="preserve">Se ajustaron la secuencia y la distribución del desarrollo para dar continuidad a las actividades pendientes, manteniendo los objetivos y el alcance del proyecto.</w:t>
             </w:r>
             <w:r>
               <w:rPr>
@@ -5909,14 +5860,14 @@
                 <w:sz w:val="20"/>
                 <w:szCs w:val="20"/>
               </w:rPr>
-              <w:t xml:space="preserve">Debido a la extensión del Sprint 5 hasta el 18 de octubre de 2026, el inicio del Sprint 6 se reprogramó del 13 al 19 de octubre, manteniendo su término el 26 de octubre de 2026. Este ajuste reduce el tiempo disponible para la iteración, por lo que se revis</w:t>
+              <w:t xml:space="preserve">La reprogramación de las iteraciones exige revisar la capacidad del equipo y priorizar los procesos que habilitan las siguientes funcionalidades. Los acuerdos de calendario y los traslados de trabajo se registran en los instrumentos de seguimiento correspondientes.</w:t>
             </w:r>
             <w:r>
               <w:rPr>
                 <w:sz w:val="20"/>
                 <w:szCs w:val="20"/>
               </w:rPr>
-              <w:t xml:space="preserve">ará la capacidad del equipo y se priorizarán las actividades previstas. Cualquier traslado de historias se registrará en el Product Backlog y en el seguimiento del Sprint.</w:t>
+              <w:t xml:space="preserve"/>
             </w:r>
             <w:r>
               <w:rPr>
@@ -6028,7 +5979,7 @@
                 <w:szCs w:val="20"/>
               </w:rPr>
               <w:br/>
-              <w:t xml:space="preserve">Faltan las pantallas Web conectadas de catálogo, solic</w:t>
+              <w:t xml:space="preserve">Continúan pendientes el cliente de Escritorio en PySide6, la gestión posterior de tickets, los diagnósticos y las órdenes de trabajo. También se consideran la ampliación de consultas del portal, el catálogo, las notificaciones por correo, los repuestos, la identificación mediante códigos QR y la reportería.</w:t>
             </w:r>
             <w:r>
               <w:rPr>
@@ -6037,7 +5988,7 @@
                 <w:sz w:val="20"/>
                 <w:szCs w:val="20"/>
               </w:rPr>
-              <w:t xml:space="preserve">itud y tickets. E3-H7 y E5-H13 continúan incompletas como historias de autoservicio. PySide6, gestión posterior de tickets, diagnósticos, órdenes de trabajo y correo siguen planificados desde Sprint 6; los demás incrementos mantienen la secuencia del acta.</w:t>
+              <w:t xml:space="preserve"/>
             </w:r>
             <w:r/>
           </w:p>
@@ -6055,14 +6006,14 @@
                 <w:sz w:val="20"/>
                 <w:szCs w:val="20"/>
               </w:rPr>
-              <w:t xml:space="preserve">El Sprint 5, inicialmente planificado entre el 29 de septiembre y el 12 de octubre de 2026, extendió su duración hasta el 18 de octubre de 2026. Se conserva el período original como referencia y se registra el 18 de octubre como fecha de término reprograma</w:t>
+              <w:t xml:space="preserve">La continuidad del desarrollo requiere integrar estas capacidades con los servicios disponibles y completar las pruebas de rendimiento, seguridad y aceptación antes de la entrega del sistema.</w:t>
             </w:r>
             <w:r>
               <w:rPr>
                 <w:sz w:val="20"/>
                 <w:szCs w:val="20"/>
               </w:rPr>
-              <w:t xml:space="preserve">da. Al cierre se documentarán las actividades completadas y los pendientes que deban trasladarse.</w:t>
+              <w:t xml:space="preserve"/>
             </w:r>
             <w:r>
               <w:rPr>

</xml_diff>